<commit_message>
Refactor multitable template test to support variable block counts and improve document validation
</commit_message>
<xml_diff>
--- a/finalcif/template/template_for_multitable.docx
+++ b/finalcif/template/template_for_multitable.docx
@@ -11,6 +11,11 @@
       </w:r>
       <w:r>
         <w:t xml:space="preserve"> Tables</w:t>
+      </w:r>
+    </w:p>
+    <w:p>
+      <w:r>
+        <w:t>{%p for page in blocklist|batch(3) %}</w:t>
       </w:r>
     </w:p>
     <w:tbl>
@@ -58,7 +63,7 @@
                 <w:sz w:val="16"/>
                 <w:szCs w:val="16"/>
               </w:rPr>
-              <w:t>blocklist</w:t>
+              <w:t>page</w:t>
             </w:r>
             <w:r>
               <w:rPr>
@@ -169,7 +174,7 @@
                 <w:sz w:val="16"/>
                 <w:szCs w:val="16"/>
               </w:rPr>
-              <w:t>blocklist</w:t>
+              <w:t>page</w:t>
             </w:r>
             <w:r>
               <w:rPr>
@@ -280,7 +285,7 @@
                 <w:sz w:val="16"/>
                 <w:szCs w:val="16"/>
               </w:rPr>
-              <w:t>blocklist</w:t>
+              <w:t>page</w:t>
             </w:r>
             <w:r>
               <w:rPr>
@@ -379,7 +384,7 @@
                 <w:sz w:val="16"/>
                 <w:szCs w:val="16"/>
               </w:rPr>
-              <w:t>blocklist</w:t>
+              <w:t>page</w:t>
             </w:r>
             <w:r>
               <w:rPr>
@@ -469,7 +474,7 @@
                 <w:sz w:val="16"/>
                 <w:szCs w:val="16"/>
               </w:rPr>
-              <w:t>blocklist</w:t>
+              <w:t>page</w:t>
             </w:r>
             <w:r>
               <w:rPr>
@@ -559,7 +564,7 @@
                 <w:sz w:val="16"/>
                 <w:szCs w:val="16"/>
               </w:rPr>
-              <w:t>blocklist</w:t>
+              <w:t>page</w:t>
             </w:r>
             <w:r>
               <w:rPr>
@@ -649,7 +654,7 @@
                 <w:sz w:val="16"/>
                 <w:szCs w:val="16"/>
               </w:rPr>
-              <w:t>blocklist</w:t>
+              <w:t>page</w:t>
             </w:r>
             <w:r>
               <w:rPr>
@@ -774,7 +779,7 @@
                 <w:sz w:val="16"/>
                 <w:szCs w:val="16"/>
               </w:rPr>
-              <w:t>blocklist</w:t>
+              <w:t>page</w:t>
             </w:r>
             <w:r>
               <w:rPr>
@@ -896,7 +901,7 @@
                 <w:sz w:val="16"/>
                 <w:szCs w:val="16"/>
               </w:rPr>
-              <w:t>blocklist</w:t>
+              <w:t>page</w:t>
             </w:r>
             <w:r>
               <w:rPr>
@@ -1019,7 +1024,7 @@
                 <w:sz w:val="16"/>
                 <w:szCs w:val="16"/>
               </w:rPr>
-              <w:t>blocklist</w:t>
+              <w:t>page</w:t>
             </w:r>
             <w:r>
               <w:rPr>
@@ -1139,7 +1144,7 @@
                 <w:sz w:val="16"/>
                 <w:szCs w:val="16"/>
               </w:rPr>
-              <w:t>blocklist</w:t>
+              <w:t>page</w:t>
             </w:r>
             <w:r>
               <w:rPr>
@@ -1247,7 +1252,7 @@
                 <w:sz w:val="16"/>
                 <w:szCs w:val="16"/>
               </w:rPr>
-              <w:t>blocklist</w:t>
+              <w:t>page</w:t>
             </w:r>
             <w:r>
               <w:rPr>
@@ -1355,7 +1360,7 @@
                 <w:sz w:val="16"/>
                 <w:szCs w:val="16"/>
               </w:rPr>
-              <w:t>blocklist</w:t>
+              <w:t>page</w:t>
             </w:r>
             <w:r>
               <w:rPr>
@@ -1478,7 +1483,7 @@
                 <w:sz w:val="16"/>
                 <w:szCs w:val="16"/>
               </w:rPr>
-              <w:t>blocklist</w:t>
+              <w:t>page</w:t>
             </w:r>
             <w:r>
               <w:rPr>
@@ -1595,7 +1600,7 @@
                 <w:sz w:val="16"/>
                 <w:szCs w:val="16"/>
               </w:rPr>
-              <w:t>blocklist</w:t>
+              <w:t>page</w:t>
             </w:r>
             <w:r>
               <w:rPr>
@@ -1725,7 +1730,7 @@
                 <w:sz w:val="16"/>
                 <w:szCs w:val="16"/>
               </w:rPr>
-              <w:t>blocklist</w:t>
+              <w:t>page</w:t>
             </w:r>
             <w:r>
               <w:rPr>
@@ -1843,7 +1848,7 @@
                 <w:sz w:val="16"/>
                 <w:szCs w:val="16"/>
               </w:rPr>
-              <w:t>blocklist</w:t>
+              <w:t>page</w:t>
             </w:r>
             <w:r>
               <w:rPr>
@@ -1957,7 +1962,7 @@
                 <w:sz w:val="16"/>
                 <w:szCs w:val="16"/>
               </w:rPr>
-              <w:t>blocklist</w:t>
+              <w:t>page</w:t>
             </w:r>
             <w:r>
               <w:rPr>
@@ -2068,7 +2073,7 @@
                 <w:sz w:val="16"/>
                 <w:szCs w:val="16"/>
               </w:rPr>
-              <w:t>blocklist</w:t>
+              <w:t>page</w:t>
             </w:r>
             <w:r>
               <w:rPr>
@@ -2164,7 +2169,7 @@
                 <w:sz w:val="16"/>
                 <w:szCs w:val="16"/>
               </w:rPr>
-              <w:t>blocklist</w:t>
+              <w:t>page</w:t>
             </w:r>
             <w:r>
               <w:rPr>
@@ -2260,7 +2265,7 @@
                 <w:sz w:val="16"/>
                 <w:szCs w:val="16"/>
               </w:rPr>
-              <w:t>blocklist</w:t>
+              <w:t>page</w:t>
             </w:r>
             <w:r>
               <w:rPr>
@@ -2362,7 +2367,7 @@
                 <w:sz w:val="16"/>
                 <w:szCs w:val="16"/>
               </w:rPr>
-              <w:t>blocklist</w:t>
+              <w:t>page</w:t>
             </w:r>
             <w:r>
               <w:rPr>
@@ -2521,7 +2526,7 @@
                 <w:sz w:val="16"/>
                 <w:szCs w:val="16"/>
               </w:rPr>
-              <w:t>blocklist</w:t>
+              <w:t>page</w:t>
             </w:r>
             <w:r>
               <w:rPr>
@@ -2617,7 +2622,7 @@
                 <w:sz w:val="16"/>
                 <w:szCs w:val="16"/>
               </w:rPr>
-              <w:t>blocklist</w:t>
+              <w:t>page</w:t>
             </w:r>
             <w:r>
               <w:rPr>
@@ -2713,7 +2718,7 @@
                 <w:sz w:val="16"/>
                 <w:szCs w:val="16"/>
               </w:rPr>
-              <w:t>blocklist</w:t>
+              <w:t>page</w:t>
             </w:r>
             <w:r>
               <w:rPr>
@@ -2809,7 +2814,7 @@
                 <w:sz w:val="16"/>
                 <w:szCs w:val="16"/>
               </w:rPr>
-              <w:t>blocklist</w:t>
+              <w:t>page</w:t>
             </w:r>
             <w:r>
               <w:rPr>
@@ -2985,7 +2990,7 @@
                 <w:sz w:val="16"/>
                 <w:szCs w:val="16"/>
               </w:rPr>
-              <w:t>blocklist</w:t>
+              <w:t>page</w:t>
             </w:r>
             <w:r>
               <w:rPr>
@@ -3032,7 +3037,21 @@
                 <w:sz w:val="12"/>
                 <w:szCs w:val="16"/>
               </w:rPr>
-              <w:t>|float(2)</w:t>
+              <w:t>|float</w:t>
+            </w:r>
+            <w:r>
+              <w:rPr>
+                <w:sz w:val="12"/>
+                <w:szCs w:val="16"/>
+              </w:rPr>
+              <w:t>_num</w:t>
+            </w:r>
+            <w:r>
+              <w:rPr>
+                <w:sz w:val="12"/>
+                <w:szCs w:val="16"/>
+              </w:rPr>
+              <w:t>(2)</w:t>
             </w:r>
             <w:r>
               <w:rPr>
@@ -3086,7 +3105,21 @@
                 <w:sz w:val="12"/>
                 <w:szCs w:val="16"/>
               </w:rPr>
-              <w:t>|float(2)</w:t>
+              <w:t>|float</w:t>
+            </w:r>
+            <w:r>
+              <w:rPr>
+                <w:sz w:val="12"/>
+                <w:szCs w:val="16"/>
+              </w:rPr>
+              <w:t>_num</w:t>
+            </w:r>
+            <w:r>
+              <w:rPr>
+                <w:sz w:val="12"/>
+                <w:szCs w:val="16"/>
+              </w:rPr>
+              <w:t>(2)</w:t>
             </w:r>
             <w:r>
               <w:rPr>
@@ -3159,7 +3192,7 @@
                 <w:sz w:val="16"/>
                 <w:szCs w:val="16"/>
               </w:rPr>
-              <w:t>blocklist</w:t>
+              <w:t>page</w:t>
             </w:r>
             <w:r>
               <w:rPr>
@@ -3315,7 +3348,7 @@
                 <w:sz w:val="16"/>
                 <w:szCs w:val="16"/>
               </w:rPr>
-              <w:t>blocklist</w:t>
+              <w:t>page</w:t>
             </w:r>
             <w:r>
               <w:rPr>
@@ -3461,7 +3494,7 @@
                 <w:sz w:val="16"/>
                 <w:szCs w:val="16"/>
               </w:rPr>
-              <w:t>blocklist</w:t>
+              <w:t>page</w:t>
             </w:r>
             <w:r>
               <w:rPr>
@@ -3602,7 +3635,7 @@
                 <w:sz w:val="16"/>
                 <w:szCs w:val="16"/>
               </w:rPr>
-              <w:t>blocklist</w:t>
+              <w:t>page</w:t>
             </w:r>
             <w:r>
               <w:rPr>
@@ -3772,7 +3805,7 @@
                 <w:sz w:val="16"/>
                 <w:szCs w:val="16"/>
               </w:rPr>
-              <w:t>blocklist</w:t>
+              <w:t>page</w:t>
             </w:r>
             <w:r>
               <w:rPr>
@@ -3945,7 +3978,7 @@
                 <w:sz w:val="16"/>
                 <w:szCs w:val="16"/>
               </w:rPr>
-              <w:t>blocklist</w:t>
+              <w:t>page</w:t>
             </w:r>
             <w:r>
               <w:rPr>
@@ -4113,7 +4146,7 @@
                 <w:sz w:val="16"/>
                 <w:szCs w:val="16"/>
               </w:rPr>
-              <w:t>blocklist</w:t>
+              <w:t>page</w:t>
             </w:r>
             <w:r>
               <w:rPr>
@@ -4241,7 +4274,7 @@
                 <w:sz w:val="16"/>
                 <w:szCs w:val="16"/>
               </w:rPr>
-              <w:t>blocklist</w:t>
+              <w:t>page</w:t>
             </w:r>
             <w:r>
               <w:rPr>
@@ -4333,6 +4366,27 @@
         </w:tc>
       </w:tr>
     </w:tbl>
+    <w:p>
+      <w:r>
+        <w:t>{%p if not loop.last %}</w:t>
+      </w:r>
+    </w:p>
+    <w:p>
+      <w:r>
+        <w:br w:type="page"/>
+      </w:r>
+    </w:p>
+    <w:p>
+      <w:r>
+        <w:lastRenderedPageBreak/>
+        <w:t>{%p endif %}</w:t>
+      </w:r>
+    </w:p>
+    <w:p>
+      <w:r>
+        <w:t>{%p endfor %}</w:t>
+      </w:r>
+    </w:p>
     <w:p>
       <w:pPr>
         <w:rPr>

</xml_diff>